<commit_message>
Rule-by-rule citation audit against the Rules as in force; four corrections (v5.5)
- Verified every cited rule against legislation.qld.gov.au and official
  QIRC form texts; guide confirms de novo + Appellant onus
- Corrected: Form 4 header basis (IR Act ss 527/989 + r 8, per the
  official form, replacing rule 4(2)); production attribution 64D ->
  64B(1); ground (e) gloss to 'confidentiality'; 64F stay wording
  aligned to rule text
- Pagination and email page references unchanged; all validations pass;
  metadata zero on both formats

https://claude.ai/code/session_01P17mt65P6No5vkc3DV9xfU
</commit_message>
<xml_diff>
--- a/wc2024227/lodgement/WC2024227_Form_4_Application_Rule_64G.docx
+++ b/wc2024227/lodgement/WC2024227_Form_4_Application_Rule_64G.docx
@@ -35,7 +35,7 @@
           <w:sz w:val="22"/>
           <w:szCs w:val="22"/>
         </w:rPr>
-        <w:t xml:space="preserve">Industrial Relations (Tribunals) Rules 2011 — rule 4(2)</w:t>
+        <w:t xml:space="preserve">Industrial Relations Act 2016, s 527, s 989 · Industrial Relations (Tribunals) Rules 2011, r 8</w:t>
       </w:r>
     </w:p>
     <w:p>
@@ -399,7 +399,7 @@
           <w:sz w:val="22"/>
           <w:szCs w:val="22"/>
         </w:rPr>
-        <w:t xml:space="preserve">The Notice was sealed by the Industrial Registry on 22 April 2026 and served on MSH by email at 5:08 PM that day. By direction issued from Chambers on 22 May 2026 (in effect, leave under rule 64E(1) for objection at a later time), MSH was directed to provide any objections by 4:00 PM on 5 June 2026. MSH’s objection was served by email at 3:02 PM on 5 June 2026. Rule 64G(1) permits this application within seven days after service of the objection; it is made within that period. Rule 64F stays the Notice as to the documents objected to; this application brings the stayed Items before the Commission for decision.</w:t>
+        <w:t xml:space="preserve">The Notice was sealed by the Industrial Registry on 22 April 2026 and served on MSH by email at 5:08 PM that day. By direction issued from Chambers on 22 May 2026 (in effect, leave under rule 64E(1) for objection at a later time), MSH was directed to provide any objections by 4:00 PM on 5 June 2026. MSH’s objection was served by email at 3:02 PM on 5 June 2026. Rule 64G(1) permits this application within seven days after service of the objection; it is made within that period. Service of the objection operates as a stay of the Notice (rule 64F); this application brings the objected-to Items before the Commission for decision.</w:t>
       </w:r>
     </w:p>
     <w:p>
@@ -487,7 +487,7 @@
           <w:sz w:val="22"/>
           <w:szCs w:val="22"/>
         </w:rPr>
-        <w:t xml:space="preserve"> for Items 3(a), 3(b), 8, 9, 10, 12 (balance), 17, 18 and 19, MSH objects on grounds of expense and inconvenience (rule 64E(4)(a)), relevance (4(b)), particularity (4(c)), privacy (4(e)) and effect on a person (4(f)). Of these nine, the Appellant presses six, each on narrowed terms, and does not press three. None of the objections is put on the basis that the documents do not exist.</w:t>
+        <w:t xml:space="preserve"> for Items 3(a), 3(b), 8, 9, 10, 12 (balance), 17, 18 and 19, MSH objects on grounds of expense and inconvenience (rule 64E(4)(a)), relevance (4(b)), particularity (4(c)), confidentiality (4(e)) and effect on a person (4(f)). Of these nine, the Appellant presses six, each on narrowed terms, and does not press three. None of the objections is put on the basis that the documents do not exist.</w:t>
       </w:r>
     </w:p>
     <w:p>
@@ -521,7 +521,7 @@
           <w:sz w:val="22"/>
           <w:szCs w:val="22"/>
         </w:rPr>
-        <w:t xml:space="preserve">Subdivision 7A allocates functions. The party issuing a notice must state in it the matter in issue (rule 64C(1)). The non-party’s part is to produce (rule 64D) or to object on the grounds rule 64E(4) provides. Where an objection is contested, the decision belongs to the Commission (rule 64G). Nothing in the subdivision asks the non-party to settle the scope of the appeal, or to measure relevance against its own restatement of the issues. That involves no criticism of MSH, whose reading is naturally operational; but it frames what the Commission is asked to decide.</w:t>
+        <w:t xml:space="preserve">Subdivision 7A allocates functions. The party issuing a notice must state in it the matter in issue (rule 64C(1)). The non-party’s part is to produce (rule 64B(1)) or to object on the grounds rule 64E(4) provides. Where an objection is contested, the decision belongs to the Commission (rule 64G). Nothing in the subdivision asks the non-party to settle the scope of the appeal, or to measure relevance against its own restatement of the issues. That involves no criticism of MSH, whose reading is naturally operational; but it frames what the Commission is asked to decide.</w:t>
       </w:r>
     </w:p>
     <w:p>

</xml_diff>